<commit_message>
Escena 8: usar el error exacto de la hoja (lím x→-3 de 2/(x+3))
Reemplaza el ejemplo genérico por la propuesta errónea real del
cuaderno del usuario: lím x→-3 2/(x+3) = 2/0 = ∞, con la cita textual
"como dio infinito, el límite existe y la función es continua en
x=-3". La escena ahora demuestra con los límites laterales (-∞ ≠ +∞)
por qué esa conclusión es incorrecta, y luego retoma la conclusión
correcta del caso asignado (h(x)=1/(x-2) en x=2). Verificado con
sympy. Duración total del video: 3:54 (dentro de 3:00-4:00).

Co-Authored-By: Claude Sonnet 5 <noreply@anthropic.com>
Claude-Session: https://claude.ai/code/session_01VVeijaq6sb9xZHfaL9btaL
</commit_message>
<xml_diff>
--- a/video_estacion2/Guion_Estacion2.docx
+++ b/video_estacion2/Guion_Estacion2.docx
@@ -24,7 +24,7 @@
         <w:br/>
         <w:t>Grupo 4: Sofía Cabrera · Micaela Cubilla · Fabrizio Riquelme · Jerónimo Lovera</w:t>
         <w:br/>
-        <w:t>Duración total del video: 3:50 min — Video_Estacion2_CasoDeEstudio.mp4</w:t>
+        <w:t>Duración total del video: 3:54 min — Video_Estacion2_CasoDeEstudio.mp4</w:t>
       </w:r>
     </w:p>
     <w:p/>
@@ -1226,7 +1226,17 @@
         <w:pStyle w:val="Heading1"/>
       </w:pPr>
       <w:r>
-        <w:t>Escena 8 — Error detectado y cierre  (3:20–3:50)</w:t>
+        <w:t>Escena 8 — Errores frecuentes y cierre  (3:20–3:54)</w:t>
+      </w:r>
+    </w:p>
+    <w:p>
+      <w:r>
+        <w:rPr>
+          <w:i/>
+          <w:color w:val="666666"/>
+          <w:sz w:val="20"/>
+        </w:rPr>
+        <w:t>Esta escena usa el ejemplo de error frecuente tal como figura en la hoja (lím x→−3 de 2/(x+3) = 2/0 = ∞), que es distinto de nuestro caso asignado (h(x) = 1/(x−2) en x = 2). Primero se muestra la conclusión errónea de la hoja y por qué está mal; después se retoma la conclusión correcta de nuestro propio caso.</w:t>
       </w:r>
     </w:p>
     <w:p>
@@ -1254,7 +1264,7 @@
           <w:color w:val="1A1A1A"/>
           <w:sz w:val="24"/>
         </w:rPr>
-        <w:t>Por último, les contamos un error muy común.</w:t>
+        <w:t>Para cerrar, miremos un error muy frecuente, tal como lo plantea la hoja.</w:t>
       </w:r>
     </w:p>
     <w:p>
@@ -1282,7 +1292,7 @@
           <w:color w:val="1A1A1A"/>
           <w:sz w:val="24"/>
         </w:rPr>
-        <w:t>Muchos piensan que, si el límite 'da infinito', entonces la función es continua.</w:t>
+        <w:t>La propuesta dice así: el límite, cuando equis tiende a menos tres, de dos sobre, equis más tres, da dos sobre cero, es decir, infinito.</w:t>
       </w:r>
     </w:p>
     <w:p>
@@ -1295,7 +1305,7 @@
           <w:color w:val="666666"/>
           <w:sz w:val="20"/>
         </w:rPr>
-        <w:t xml:space="preserve">[3:30]  </w:t>
+        <w:t xml:space="preserve">[3:31]  </w:t>
       </w:r>
       <w:r>
         <w:rPr>
@@ -1310,7 +1320,7 @@
           <w:color w:val="1A1A1A"/>
           <w:sz w:val="24"/>
         </w:rPr>
-        <w:t>Pero eso es incorrecto: un límite infinito, o un límite que no existe, significa justamente que la función NO es continua.</w:t>
+        <w:t>Y de ahí concluyen, textualmente: «como dio infinito, el límite existe, y la función es continua en equis igual a menos tres».</w:t>
       </w:r>
     </w:p>
     <w:p>
@@ -1338,7 +1348,7 @@
           <w:color w:val="1A1A1A"/>
           <w:sz w:val="24"/>
         </w:rPr>
-        <w:t>La conclusión correcta es: h de x es discontinua en x igual a dos, con una discontinuidad inevitable de salto infinito, porque la recta x igual a dos es asíntota vertical.</w:t>
+        <w:t>Pero eso está mal: que dé infinito significa que el límite NO existe, porque por un lado da menos infinito, y por el otro, más infinito.</w:t>
       </w:r>
     </w:p>
     <w:p>
@@ -1351,7 +1361,35 @@
           <w:color w:val="666666"/>
           <w:sz w:val="20"/>
         </w:rPr>
-        <w:t xml:space="preserve">[3:48]  </w:t>
+        <w:t xml:space="preserve">[3:46]  </w:t>
+      </w:r>
+      <w:r>
+        <w:rPr>
+          <w:b/>
+          <w:color w:val="926C05"/>
+          <w:sz w:val="24"/>
+        </w:rPr>
+        <w:t xml:space="preserve">Jerónimo: </w:t>
+      </w:r>
+      <w:r>
+        <w:rPr>
+          <w:color w:val="1A1A1A"/>
+          <w:sz w:val="24"/>
+        </w:rPr>
+        <w:t>Volviendo a nuestro caso: h de equis es discontinua en equis igual a dos, con una discontinuidad inevitable de salto infinito, porque x igual a dos es asíntota vertical.</w:t>
+      </w:r>
+    </w:p>
+    <w:p>
+      <w:pPr>
+        <w:spacing w:after="160"/>
+      </w:pPr>
+      <w:r>
+        <w:rPr>
+          <w:i/>
+          <w:color w:val="666666"/>
+          <w:sz w:val="20"/>
+        </w:rPr>
+        <w:t xml:space="preserve">[3:53]  </w:t>
       </w:r>
       <w:r>
         <w:rPr>

</xml_diff>

<commit_message>
Re-renderizar video con la nueva paleta de colores
MP4 finales actualizados con fondo violeta/ciruela y acentos celeste,
coral/ámbar, orquídea y amarillo. Duración total sin cambios: 3:54.

Co-Authored-By: Claude Sonnet 5 <noreply@anthropic.com>
Claude-Session: https://claude.ai/code/session_01VVeijaq6sb9xZHfaL9btaL
</commit_message>
<xml_diff>
--- a/video_estacion2/Guion_Estacion2.docx
+++ b/video_estacion2/Guion_Estacion2.docx
@@ -85,7 +85,7 @@
             <w:r>
               <w:rPr>
                 <w:b/>
-                <w:color w:val="0D9488"/>
+                <w:color w:val="057DA6"/>
               </w:rPr>
               <w:t>Sofía</w:t>
             </w:r>
@@ -94,7 +94,7 @@
         <w:tc>
           <w:tcPr>
             <w:tcW w:type="dxa" w:w="4986"/>
-            <w:shd w:val="clear" w:color="auto" w:fill="2dd4bf"/>
+            <w:shd w:val="clear" w:color="auto" w:fill="4cc9f0"/>
           </w:tcPr>
           <w:p/>
         </w:tc>
@@ -117,7 +117,7 @@
         <w:tc>
           <w:tcPr>
             <w:tcW w:type="dxa" w:w="4986"/>
-            <w:shd w:val="clear" w:color="auto" w:fill="fb923c"/>
+            <w:shd w:val="clear" w:color="auto" w:fill="ff8c42"/>
           </w:tcPr>
           <w:p/>
         </w:tc>
@@ -131,7 +131,7 @@
             <w:r>
               <w:rPr>
                 <w:b/>
-                <w:color w:val="6D28D9"/>
+                <w:color w:val="7C1FC2"/>
               </w:rPr>
               <w:t>Fabrizio</w:t>
             </w:r>
@@ -140,7 +140,7 @@
         <w:tc>
           <w:tcPr>
             <w:tcW w:type="dxa" w:w="4986"/>
-            <w:shd w:val="clear" w:color="auto" w:fill="a78bfa"/>
+            <w:shd w:val="clear" w:color="auto" w:fill="c77dff"/>
           </w:tcPr>
           <w:p/>
         </w:tc>
@@ -154,7 +154,7 @@
             <w:r>
               <w:rPr>
                 <w:b/>
-                <w:color w:val="926C05"/>
+                <w:color w:val="927200"/>
               </w:rPr>
               <w:t>Jerónimo</w:t>
             </w:r>
@@ -163,7 +163,7 @@
         <w:tc>
           <w:tcPr>
             <w:tcW w:type="dxa" w:w="4986"/>
-            <w:shd w:val="clear" w:color="auto" w:fill="fbbf24"/>
+            <w:shd w:val="clear" w:color="auto" w:fill="ffd166"/>
           </w:tcPr>
           <w:p/>
         </w:tc>
@@ -201,7 +201,7 @@
       <w:r>
         <w:rPr>
           <w:b/>
-          <w:color w:val="0D9488"/>
+          <w:color w:val="057DA6"/>
           <w:sz w:val="24"/>
         </w:rPr>
         <w:t xml:space="preserve">Sofía: </w:t>
@@ -229,7 +229,7 @@
       <w:r>
         <w:rPr>
           <w:b/>
-          <w:color w:val="0D9488"/>
+          <w:color w:val="057DA6"/>
           <w:sz w:val="24"/>
         </w:rPr>
         <w:t xml:space="preserve">Sofía: </w:t>
@@ -257,7 +257,7 @@
       <w:r>
         <w:rPr>
           <w:b/>
-          <w:color w:val="0D9488"/>
+          <w:color w:val="057DA6"/>
           <w:sz w:val="24"/>
         </w:rPr>
         <w:t xml:space="preserve">Sofía: </w:t>
@@ -285,7 +285,7 @@
       <w:r>
         <w:rPr>
           <w:b/>
-          <w:color w:val="0D9488"/>
+          <w:color w:val="057DA6"/>
           <w:sz w:val="24"/>
         </w:rPr>
         <w:t xml:space="preserve">Sofía: </w:t>
@@ -326,7 +326,7 @@
       <w:r>
         <w:rPr>
           <w:b/>
-          <w:color w:val="0D9488"/>
+          <w:color w:val="057DA6"/>
           <w:sz w:val="24"/>
         </w:rPr>
         <w:t xml:space="preserve">Sofía: </w:t>
@@ -354,7 +354,7 @@
       <w:r>
         <w:rPr>
           <w:b/>
-          <w:color w:val="0D9488"/>
+          <w:color w:val="057DA6"/>
           <w:sz w:val="24"/>
         </w:rPr>
         <w:t xml:space="preserve">Sofía: </w:t>
@@ -382,7 +382,7 @@
       <w:r>
         <w:rPr>
           <w:b/>
-          <w:color w:val="0D9488"/>
+          <w:color w:val="057DA6"/>
           <w:sz w:val="24"/>
         </w:rPr>
         <w:t xml:space="preserve">Sofía: </w:t>
@@ -410,7 +410,7 @@
       <w:r>
         <w:rPr>
           <w:b/>
-          <w:color w:val="0D9488"/>
+          <w:color w:val="057DA6"/>
           <w:sz w:val="24"/>
         </w:rPr>
         <w:t xml:space="preserve">Sofía: </w:t>
@@ -438,7 +438,7 @@
       <w:r>
         <w:rPr>
           <w:b/>
-          <w:color w:val="0D9488"/>
+          <w:color w:val="057DA6"/>
           <w:sz w:val="24"/>
         </w:rPr>
         <w:t xml:space="preserve">Sofía: </w:t>
@@ -757,7 +757,7 @@
       <w:r>
         <w:rPr>
           <w:b/>
-          <w:color w:val="6D28D9"/>
+          <w:color w:val="7C1FC2"/>
           <w:sz w:val="24"/>
         </w:rPr>
         <w:t xml:space="preserve">Fabrizio: </w:t>
@@ -785,7 +785,7 @@
       <w:r>
         <w:rPr>
           <w:b/>
-          <w:color w:val="6D28D9"/>
+          <w:color w:val="7C1FC2"/>
           <w:sz w:val="24"/>
         </w:rPr>
         <w:t xml:space="preserve">Fabrizio: </w:t>
@@ -813,7 +813,7 @@
       <w:r>
         <w:rPr>
           <w:b/>
-          <w:color w:val="6D28D9"/>
+          <w:color w:val="7C1FC2"/>
           <w:sz w:val="24"/>
         </w:rPr>
         <w:t xml:space="preserve">Fabrizio: </w:t>
@@ -841,7 +841,7 @@
       <w:r>
         <w:rPr>
           <w:b/>
-          <w:color w:val="6D28D9"/>
+          <w:color w:val="7C1FC2"/>
           <w:sz w:val="24"/>
         </w:rPr>
         <w:t xml:space="preserve">Fabrizio: </w:t>
@@ -869,7 +869,7 @@
       <w:r>
         <w:rPr>
           <w:b/>
-          <w:color w:val="6D28D9"/>
+          <w:color w:val="7C1FC2"/>
           <w:sz w:val="24"/>
         </w:rPr>
         <w:t xml:space="preserve">Fabrizio: </w:t>
@@ -897,7 +897,7 @@
       <w:r>
         <w:rPr>
           <w:b/>
-          <w:color w:val="6D28D9"/>
+          <w:color w:val="7C1FC2"/>
           <w:sz w:val="24"/>
         </w:rPr>
         <w:t xml:space="preserve">Fabrizio: </w:t>
@@ -938,7 +938,7 @@
       <w:r>
         <w:rPr>
           <w:b/>
-          <w:color w:val="6D28D9"/>
+          <w:color w:val="7C1FC2"/>
           <w:sz w:val="24"/>
         </w:rPr>
         <w:t xml:space="preserve">Fabrizio: </w:t>
@@ -966,7 +966,7 @@
       <w:r>
         <w:rPr>
           <w:b/>
-          <w:color w:val="6D28D9"/>
+          <w:color w:val="7C1FC2"/>
           <w:sz w:val="24"/>
         </w:rPr>
         <w:t xml:space="preserve">Fabrizio: </w:t>
@@ -994,7 +994,7 @@
       <w:r>
         <w:rPr>
           <w:b/>
-          <w:color w:val="6D28D9"/>
+          <w:color w:val="7C1FC2"/>
           <w:sz w:val="24"/>
         </w:rPr>
         <w:t xml:space="preserve">Fabrizio: </w:t>
@@ -1022,7 +1022,7 @@
       <w:r>
         <w:rPr>
           <w:b/>
-          <w:color w:val="6D28D9"/>
+          <w:color w:val="7C1FC2"/>
           <w:sz w:val="24"/>
         </w:rPr>
         <w:t xml:space="preserve">Fabrizio: </w:t>
@@ -1063,7 +1063,7 @@
       <w:r>
         <w:rPr>
           <w:b/>
-          <w:color w:val="926C05"/>
+          <w:color w:val="927200"/>
           <w:sz w:val="24"/>
         </w:rPr>
         <w:t xml:space="preserve">Jerónimo: </w:t>
@@ -1091,7 +1091,7 @@
       <w:r>
         <w:rPr>
           <w:b/>
-          <w:color w:val="926C05"/>
+          <w:color w:val="927200"/>
           <w:sz w:val="24"/>
         </w:rPr>
         <w:t xml:space="preserve">Jerónimo: </w:t>
@@ -1119,7 +1119,7 @@
       <w:r>
         <w:rPr>
           <w:b/>
-          <w:color w:val="926C05"/>
+          <w:color w:val="927200"/>
           <w:sz w:val="24"/>
         </w:rPr>
         <w:t xml:space="preserve">Jerónimo: </w:t>
@@ -1147,7 +1147,7 @@
       <w:r>
         <w:rPr>
           <w:b/>
-          <w:color w:val="926C05"/>
+          <w:color w:val="927200"/>
           <w:sz w:val="24"/>
         </w:rPr>
         <w:t xml:space="preserve">Jerónimo: </w:t>
@@ -1175,7 +1175,7 @@
       <w:r>
         <w:rPr>
           <w:b/>
-          <w:color w:val="926C05"/>
+          <w:color w:val="927200"/>
           <w:sz w:val="24"/>
         </w:rPr>
         <w:t xml:space="preserve">Jerónimo: </w:t>
@@ -1203,7 +1203,7 @@
       <w:r>
         <w:rPr>
           <w:b/>
-          <w:color w:val="926C05"/>
+          <w:color w:val="927200"/>
           <w:sz w:val="24"/>
         </w:rPr>
         <w:t xml:space="preserve">Jerónimo: </w:t>
@@ -1254,7 +1254,7 @@
       <w:r>
         <w:rPr>
           <w:b/>
-          <w:color w:val="926C05"/>
+          <w:color w:val="927200"/>
           <w:sz w:val="24"/>
         </w:rPr>
         <w:t xml:space="preserve">Jerónimo: </w:t>
@@ -1282,7 +1282,7 @@
       <w:r>
         <w:rPr>
           <w:b/>
-          <w:color w:val="926C05"/>
+          <w:color w:val="927200"/>
           <w:sz w:val="24"/>
         </w:rPr>
         <w:t xml:space="preserve">Jerónimo: </w:t>
@@ -1310,7 +1310,7 @@
       <w:r>
         <w:rPr>
           <w:b/>
-          <w:color w:val="926C05"/>
+          <w:color w:val="927200"/>
           <w:sz w:val="24"/>
         </w:rPr>
         <w:t xml:space="preserve">Jerónimo: </w:t>
@@ -1338,7 +1338,7 @@
       <w:r>
         <w:rPr>
           <w:b/>
-          <w:color w:val="926C05"/>
+          <w:color w:val="927200"/>
           <w:sz w:val="24"/>
         </w:rPr>
         <w:t xml:space="preserve">Jerónimo: </w:t>
@@ -1366,7 +1366,7 @@
       <w:r>
         <w:rPr>
           <w:b/>
-          <w:color w:val="926C05"/>
+          <w:color w:val="927200"/>
           <w:sz w:val="24"/>
         </w:rPr>
         <w:t xml:space="preserve">Jerónimo: </w:t>
@@ -1394,7 +1394,7 @@
       <w:r>
         <w:rPr>
           <w:b/>
-          <w:color w:val="1F2937"/>
+          <w:color w:val="2A1845"/>
           <w:sz w:val="24"/>
         </w:rPr>
         <w:t xml:space="preserve">TODOS: </w:t>

</xml_diff>